<commit_message>
docs: actualizar README y documentacion .docx con nuevas categorias y React Router
</commit_message>
<xml_diff>
--- a/PitLane_Documentacion.docx
+++ b/PitLane_Documentacion.docx
@@ -22,7 +22,7 @@
         </w:rPr>
         <w:t>Documentación Técnica de la Aplicación</w:t>
         <w:br/>
-        <w:t>Calendario de Fórmula 1, F2 y F3</w:t>
+        <w:t>Calendario de F1, F2, F3 y Categorías Adicionales</w:t>
       </w:r>
     </w:p>
     <w:p>
@@ -33,15 +33,15 @@
         <w:rPr>
           <w:b/>
         </w:rPr>
-        <w:t>Versión: Alpha 0.1.0</w:t>
+        <w:t>Versión: Alpha 0.2.0</w:t>
         <w:br/>
       </w:r>
       <w:r>
-        <w:t>Fecha: 04/06/2026</w:t>
+        <w:t>Fecha: 15/06/2026</w:t>
         <w:br/>
       </w:r>
       <w:r>
-        <w:t>Framework: React 19 + Vite 8 + Tailwind CSS v4</w:t>
+        <w:t>Framework: React 19 + Vite 8 + Tailwind CSS v4 + React Router</w:t>
         <w:br/>
       </w:r>
       <w:r>
@@ -63,7 +63,7 @@
     </w:p>
     <w:p>
       <w:r>
-        <w:t>PitLane es una Single Page Application (SPA) en fase Alpha que muestra el calendario de carreras de Fórmula 1, F2 y F3 para la temporada 2026. Está diseñada con una arquitectura escalable y desacoplada, inspirada visualmente en el sitio oficial formula1.com. Actualmente desplegada automáticamente en Vercel desde GitHub.</w:t>
+        <w:t>PitLane es una Single Page Application (SPA) en fase Alpha que muestra el calendario de carreras de Fórmula 1, F2, F3 y categorías adicionales (IndyCar, NASCAR, WEC, MotoGP) para la temporada 2026. Está diseñada con una arquitectura escalable y desacoplada, inspirada visualmente en el sitio oficial formula1.com. Utiliza React Router para la navegación entre páginas. Actualmente desplegada automáticamente en Vercel desde GitHub.</w:t>
       </w:r>
     </w:p>
     <w:p>
@@ -96,6 +96,22 @@
       </w:pPr>
       <w:r>
         <w:t>Permitir filtrar entre F1, F2 y F3 sin recargar la página.</w:t>
+      </w:r>
+    </w:p>
+    <w:p>
+      <w:pPr>
+        <w:pStyle w:val="ListBullet"/>
+      </w:pPr>
+      <w:r>
+        <w:t>Ofrecer calendarios de categorías adicionales (IndyCar, NASCAR, WEC, MotoGP).</w:t>
+      </w:r>
+    </w:p>
+    <w:p>
+      <w:pPr>
+        <w:pStyle w:val="ListBullet"/>
+      </w:pPr>
+      <w:r>
+        <w:t>Navegación mediante React Router con rutas dedicadas.</w:t>
       </w:r>
     </w:p>
     <w:p>
@@ -169,7 +185,7 @@
     </w:p>
     <w:p>
       <w:r>
-        <w:t xml:space="preserve">    App.jsx                 # Componente raíz</w:t>
+        <w:t xml:space="preserve">    App.jsx                 # Componente raíz con React Router</w:t>
       </w:r>
     </w:p>
     <w:p>
@@ -179,7 +195,7 @@
     </w:p>
     <w:p>
       <w:r>
-        <w:t xml:space="preserve">      races.js              # Datos estáticos de 48 carreras (F1, F2, F3)</w:t>
+        <w:t xml:space="preserve">      races.js              # Datos estáticos de 71 carreras (7 categorías)</w:t>
       </w:r>
     </w:p>
     <w:p>
@@ -195,6 +211,11 @@
     <w:p>
       <w:r>
         <w:t xml:space="preserve">    components/</w:t>
+      </w:r>
+    </w:p>
+    <w:p>
+      <w:r>
+        <w:t xml:space="preserve">      CategoryCard.jsx      # Card de categoría con gradiente y enlace</w:t>
       </w:r>
     </w:p>
     <w:p>
@@ -223,6 +244,26 @@
       </w:r>
     </w:p>
     <w:p>
+      <w:r>
+        <w:t xml:space="preserve">    pages/</w:t>
+      </w:r>
+    </w:p>
+    <w:p>
+      <w:r>
+        <w:t xml:space="preserve">      HomePage.jsx          # Página principal con cards de categorías</w:t>
+      </w:r>
+    </w:p>
+    <w:p>
+      <w:r>
+        <w:t xml:space="preserve">      CalendarPage.jsx      # Página de calendario por categoría</w:t>
+      </w:r>
+    </w:p>
+    <w:p>
+      <w:r>
+        <w:t xml:space="preserve">      ExtrasPage.jsx        # Página de categorías adicionales</w:t>
+      </w:r>
+    </w:p>
+    <w:p>
       <w:pPr>
         <w:pStyle w:val="Heading1"/>
       </w:pPr>
@@ -250,7 +291,7 @@
     </w:p>
     <w:p>
       <w:r>
-        <w:t>Contiene un array de 48 objetos con la información de todas las carreras de la temporada 2026. Cada objeto tiene la siguiente estructura:</w:t>
+        <w:t>Contiene un array de 71 objetos con la información de todas las carreras de la temporada 2026 para 7 categorías. Cada objeto tiene la siguiente estructura:</w:t>
       </w:r>
     </w:p>
     <w:p>
@@ -270,7 +311,7 @@
         <w:br/>
         <w:t xml:space="preserve">  date: "2026-06-01",               # Fecha en formato ISO</w:t>
         <w:br/>
-        <w:t xml:space="preserve">  category: "F1",                    # Categoría: F1, F2 o F3</w:t>
+        <w:t xml:space="preserve">  category: "F1",                    # Categoría: F1, F2, F3, IndyCar, NASCAR, WEC o MotoGP</w:t>
         <w:br/>
         <w:t xml:space="preserve">  status: "upcoming"                 # Estado calculado</w:t>
         <w:br/>
@@ -292,7 +333,7 @@
     </w:p>
     <w:p>
       <w:r>
-        <w:t>Este es el núcleo de la aplicación. Centraliza toda la lógica de estado y simula una petición asíncrona. Al migrar a producción, solo se modifica este archivo.</w:t>
+        <w:t>Este es el núcleo de la aplicación. Centraliza toda la lógica de estado y simula una petición asíncrona. Al migrar a producción, solo se modifica este archivo. Acepta un parámetro initialCategory para definir la categoría inicial.</w:t>
       </w:r>
     </w:p>
     <w:p>
@@ -374,7 +415,7 @@
         <w:pStyle w:val="ListBullet"/>
       </w:pPr>
       <w:r>
-        <w:t>activeCategory: Categoría seleccionada (F1, F2, F3)</w:t>
+        <w:t>activeCategory: Categoría seleccionada</w:t>
       </w:r>
     </w:p>
     <w:p>
@@ -424,6 +465,52 @@
     </w:p>
     <w:p>
       <w:pPr>
+        <w:pStyle w:val="Heading2"/>
+      </w:pPr>
+      <w:r>
+        <w:t>3.4 Enrutamiento (React Router)</w:t>
+      </w:r>
+    </w:p>
+    <w:p>
+      <w:r>
+        <w:t>La aplicación utiliza react-router-dom para la navegación entre páginas con las siguientes rutas:</w:t>
+      </w:r>
+    </w:p>
+    <w:p>
+      <w:r>
+        <w:rPr>
+          <w:b/>
+        </w:rPr>
+        <w:t xml:space="preserve">/ — HomePage: </w:t>
+      </w:r>
+      <w:r>
+        <w:t>Página principal con cards de categorías (F1, F2, F3, Más Categorías)</w:t>
+      </w:r>
+    </w:p>
+    <w:p>
+      <w:r>
+        <w:rPr>
+          <w:b/>
+        </w:rPr>
+        <w:t xml:space="preserve">/calendar/:category — CalendarPage: </w:t>
+      </w:r>
+      <w:r>
+        <w:t>Calendario para una categoría específica (F1, F2, F3, IndyCar, NASCAR, WEC, MotoGP)</w:t>
+      </w:r>
+    </w:p>
+    <w:p>
+      <w:r>
+        <w:rPr>
+          <w:b/>
+        </w:rPr>
+        <w:t xml:space="preserve">/extras — ExtrasPage: </w:t>
+      </w:r>
+      <w:r>
+        <w:t>Categorías adicionales (IndyCar, NASCAR, WEC, MotoGP)</w:t>
+      </w:r>
+    </w:p>
+    <w:p>
+      <w:pPr>
         <w:pStyle w:val="Heading1"/>
       </w:pPr>
       <w:r>
@@ -435,7 +522,207 @@
         <w:pStyle w:val="Heading2"/>
       </w:pPr>
       <w:r>
-        <w:t>4.1 F1Dashboard (Orquestador)</w:t>
+        <w:t>4.1 CategoryCard</w:t>
+      </w:r>
+    </w:p>
+    <w:p>
+      <w:r>
+        <w:t>Archivo: src/components/CategoryCard.jsx</w:t>
+      </w:r>
+    </w:p>
+    <w:p>
+      <w:r>
+        <w:t>Componente reutilizable de card para cada categoría:</w:t>
+      </w:r>
+    </w:p>
+    <w:p>
+      <w:pPr>
+        <w:pStyle w:val="ListBullet"/>
+      </w:pPr>
+      <w:r>
+        <w:t>Gradiente de fondo único por categoría (rojo F1, azul F2, verde F3, índigo IndyCar, ámbar NASCAR, púrpura WEC, naranja MotoGP)</w:t>
+      </w:r>
+    </w:p>
+    <w:p>
+      <w:pPr>
+        <w:pStyle w:val="ListBullet"/>
+      </w:pPr>
+      <w:r>
+        <w:t>Efecto de elevación al hover (hover:-translate-y-1)</w:t>
+      </w:r>
+    </w:p>
+    <w:p>
+      <w:pPr>
+        <w:pStyle w:val="ListBullet"/>
+      </w:pPr>
+      <w:r>
+        <w:t>Círculos decorativos con blur-3xl para profundidad</w:t>
+      </w:r>
+    </w:p>
+    <w:p>
+      <w:pPr>
+        <w:pStyle w:val="ListBullet"/>
+      </w:pPr>
+      <w:r>
+        <w:t>Enlace de navegación al calendario correspondiente mediante React Router Link</w:t>
+      </w:r>
+    </w:p>
+    <w:p>
+      <w:pPr>
+        <w:pStyle w:val="ListBullet"/>
+      </w:pPr>
+      <w:r>
+        <w:t>Muestra el número de carreras disponibles para esa categoría</w:t>
+      </w:r>
+    </w:p>
+    <w:p>
+      <w:pPr>
+        <w:pStyle w:val="ListBullet"/>
+      </w:pPr>
+      <w:r>
+        <w:t>Botón "Ver calendario" con flecha animada al hover</w:t>
+      </w:r>
+    </w:p>
+    <w:p>
+      <w:pPr>
+        <w:pStyle w:val="Heading2"/>
+      </w:pPr>
+      <w:r>
+        <w:t>4.2 HomePage (Página Principal)</w:t>
+      </w:r>
+    </w:p>
+    <w:p>
+      <w:r>
+        <w:t>Archivo: src/pages/HomePage.jsx</w:t>
+      </w:r>
+    </w:p>
+    <w:p>
+      <w:r>
+        <w:t>Página principal que lista todas las categorías:</w:t>
+      </w:r>
+    </w:p>
+    <w:p>
+      <w:pPr>
+        <w:pStyle w:val="ListBullet"/>
+      </w:pPr>
+      <w:r>
+        <w:t>Header con logo PitLane y navegación</w:t>
+      </w:r>
+    </w:p>
+    <w:p>
+      <w:pPr>
+        <w:pStyle w:val="ListBullet"/>
+      </w:pPr>
+      <w:r>
+        <w:t>Sección "Categorías Principales" con cards de F1, F2 y F3</w:t>
+      </w:r>
+    </w:p>
+    <w:p>
+      <w:pPr>
+        <w:pStyle w:val="ListBullet"/>
+      </w:pPr>
+      <w:r>
+        <w:t>Sección "Otras Series" con card "Más Categorías" que muestra etiquetas de IndyCar, NASCAR, WEC, MotoGP</w:t>
+      </w:r>
+    </w:p>
+    <w:p>
+      <w:pPr>
+        <w:pStyle w:val="ListBullet"/>
+      </w:pPr>
+      <w:r>
+        <w:t>Enlace a /extras para explorar las categorías adicionales</w:t>
+      </w:r>
+    </w:p>
+    <w:p>
+      <w:pPr>
+        <w:pStyle w:val="ListBullet"/>
+      </w:pPr>
+      <w:r>
+        <w:t>Diseño responsivo con grid adaptable</w:t>
+      </w:r>
+    </w:p>
+    <w:p>
+      <w:pPr>
+        <w:pStyle w:val="ListBullet"/>
+      </w:pPr>
+      <w:r>
+        <w:t>Footer con créditos de fase Alpha</w:t>
+      </w:r>
+    </w:p>
+    <w:p>
+      <w:pPr>
+        <w:pStyle w:val="Heading2"/>
+      </w:pPr>
+      <w:r>
+        <w:t>4.3 CalendarPage (Página de Calendario)</w:t>
+      </w:r>
+    </w:p>
+    <w:p>
+      <w:r>
+        <w:t>Archivo: src/pages/CalendarPage.jsx</w:t>
+      </w:r>
+    </w:p>
+    <w:p>
+      <w:r>
+        <w:t>Extrae la categoría de los parámetros de la URL (/calendar/:category) y renderiza el componente F1Dashboard con esa categoría.</w:t>
+      </w:r>
+    </w:p>
+    <w:p>
+      <w:pPr>
+        <w:pStyle w:val="Heading2"/>
+      </w:pPr>
+      <w:r>
+        <w:t>4.4 ExtrasPage (Categorías Adicionales)</w:t>
+      </w:r>
+    </w:p>
+    <w:p>
+      <w:r>
+        <w:t>Archivo: src/pages/ExtrasPage.jsx</w:t>
+      </w:r>
+    </w:p>
+    <w:p>
+      <w:r>
+        <w:t>Página que lista las categorías adicionales disponibles:</w:t>
+      </w:r>
+    </w:p>
+    <w:p>
+      <w:pPr>
+        <w:pStyle w:val="ListBullet"/>
+      </w:pPr>
+      <w:r>
+        <w:t>Cards individuales para IndyCar Series, NASCAR Cup Series, WEC y MotoGP</w:t>
+      </w:r>
+    </w:p>
+    <w:p>
+      <w:pPr>
+        <w:pStyle w:val="ListBullet"/>
+      </w:pPr>
+      <w:r>
+        <w:t>Cada card enlaza a su calendario específico (/calendar/IndyCar, etc.)</w:t>
+      </w:r>
+    </w:p>
+    <w:p>
+      <w:pPr>
+        <w:pStyle w:val="ListBullet"/>
+      </w:pPr>
+      <w:r>
+        <w:t>Header con enlace de vuelta a la página principal</w:t>
+      </w:r>
+    </w:p>
+    <w:p>
+      <w:pPr>
+        <w:pStyle w:val="ListBullet"/>
+      </w:pPr>
+      <w:r>
+        <w:t>Footer con créditos de fase Alpha</w:t>
+      </w:r>
+    </w:p>
+    <w:p>
+      <w:pPr>
+        <w:pStyle w:val="Heading2"/>
+      </w:pPr>
+      <w:r>
+        <w:t>4.5 F1Dashboard (Orquestador)</w:t>
       </w:r>
     </w:p>
     <w:p>
@@ -445,7 +732,7 @@
     </w:p>
     <w:p>
       <w:r>
-        <w:t>Componente principal que orquesta toda la aplicación. Consume useCalendar y distribuye los datos a los componentes hijos. Incluye:</w:t>
+        <w:t>Componente principal que orquesta el calendario. Consume useCalendar con la categoría recibida como prop y distribuye los datos a los componentes hijos:</w:t>
       </w:r>
     </w:p>
     <w:p>
@@ -453,7 +740,23 @@
         <w:pStyle w:val="ListBullet"/>
       </w:pPr>
       <w:r>
-        <w:t>Header sticky con logo PitLane</w:t>
+        <w:t>Header sticky con logo PitLane y enlace "← Categorías" para volver atrás</w:t>
+      </w:r>
+    </w:p>
+    <w:p>
+      <w:pPr>
+        <w:pStyle w:val="ListBullet"/>
+      </w:pPr>
+      <w:r>
+        <w:t>Barra de navegación CategoryNav para categorías principales (F1/F2/F3)</w:t>
+      </w:r>
+    </w:p>
+    <w:p>
+      <w:pPr>
+        <w:pStyle w:val="ListBullet"/>
+      </w:pPr>
+      <w:r>
+        <w:t>Badge de categoría para categorías no principales (IndyCar, NASCAR, etc.)</w:t>
       </w:r>
     </w:p>
     <w:p>
@@ -469,7 +772,7 @@
         <w:pStyle w:val="ListBullet"/>
       </w:pPr>
       <w:r>
-        <w:t>CategoryNav, Hero y CalendarGrid en el main</w:t>
+        <w:t>Hero, CalendarGrid y estadísticas en el main</w:t>
       </w:r>
     </w:p>
     <w:p>
@@ -485,7 +788,7 @@
         <w:pStyle w:val="ListBullet"/>
       </w:pPr>
       <w:r>
-        <w:t>Efecto de vidrio (backdrop-blur-md) en el header</w:t>
+        <w:t>Navegación entre categorías usando useNavigate de React Router</w:t>
       </w:r>
     </w:p>
     <w:p>
@@ -493,7 +796,7 @@
         <w:pStyle w:val="Heading2"/>
       </w:pPr>
       <w:r>
-        <w:t>4.2 CategoryNav (Navegación de Categorías)</w:t>
+        <w:t>4.6 CategoryNav (Navegación de Categorías)</w:t>
       </w:r>
     </w:p>
     <w:p>
@@ -540,10 +843,18 @@
     </w:p>
     <w:p>
       <w:pPr>
+        <w:pStyle w:val="ListBullet"/>
+      </w:pPr>
+      <w:r>
+        <w:t>Al hacer clic, navega a la ruta de la categoría seleccionada</w:t>
+      </w:r>
+    </w:p>
+    <w:p>
+      <w:pPr>
         <w:pStyle w:val="Heading2"/>
       </w:pPr>
       <w:r>
-        <w:t>4.3 Hero (Próxima Carrera)</w:t>
+        <w:t>4.7 Hero (Próxima Carrera)</w:t>
       </w:r>
     </w:p>
     <w:p>
@@ -609,7 +920,7 @@
         <w:pStyle w:val="Heading2"/>
       </w:pPr>
       <w:r>
-        <w:t>4.4 RaceCard (Tarjeta de Carrera)</w:t>
+        <w:t>4.8 RaceCard (Tarjeta de Carrera)</w:t>
       </w:r>
     </w:p>
     <w:p>
@@ -675,7 +986,7 @@
         <w:pStyle w:val="Heading2"/>
       </w:pPr>
       <w:r>
-        <w:t>4.5 CalendarGrid (Grid de Calendario)</w:t>
+        <w:t>4.9 CalendarGrid (Grid de Calendario)</w:t>
       </w:r>
     </w:p>
     <w:p>
@@ -786,7 +1097,7 @@
     </w:p>
     <w:p>
       <w:r>
-        <w:t>También se definió la fuente Inter como tipografía principal importada desde Google Fonts en el index.html.</w:t>
+        <w:t>También se definió la fuente Inter como tipografía principal importada desde Google Fonts en el index.html. Los gradientes de las CategoryCard se definen inline con Tailwind (from-{color}-500 to-{color}-700).</w:t>
       </w:r>
     </w:p>
     <w:p>
@@ -814,62 +1125,67 @@
     </w:p>
     <w:p>
       <w:r>
-        <w:t>3. App renderiza F1Dashboard.</w:t>
+        <w:t>3. App renderiza el Router con las rutas definidas.</w:t>
       </w:r>
     </w:p>
     <w:p>
       <w:r>
-        <w:t>4. F1Dashboard ejecuta useCalendar().</w:t>
+        <w:t>4. La ruta "/" muestra HomePage con las cards de categorías.</w:t>
       </w:r>
     </w:p>
     <w:p>
       <w:r>
-        <w:t>5. useCalendar inicia la carga asíncrona simulada.</w:t>
+        <w:t>5. El usuario hace clic en una categoría (ej. F1).</w:t>
       </w:r>
     </w:p>
     <w:p>
       <w:r>
-        <w:t>6. Loading skeleton se muestra durante 600ms.</w:t>
+        <w:t>6. React Router navega a "/calendar/F1".</w:t>
       </w:r>
     </w:p>
     <w:p>
       <w:r>
-        <w:t>7. Los datos se cargan y se almacenan en el estado.</w:t>
+        <w:t>7. CalendarPage detecta el parámetro :category y renderiza F1Dashboard.</w:t>
       </w:r>
     </w:p>
     <w:p>
       <w:r>
-        <w:t>8. Se filtran las carreras por la categoría activa (F1 por defecto).</w:t>
+        <w:t>8. F1Dashboard ejecuta useCalendar("F1").</w:t>
       </w:r>
     </w:p>
     <w:p>
       <w:r>
-        <w:t>9. Se detecta la próxima carrera por fecha.</w:t>
+        <w:t>9. useCalendar inicia la carga asíncrona simulada.</w:t>
       </w:r>
     </w:p>
     <w:p>
       <w:r>
-        <w:t>10. Se renderizan CategoryNav, Hero y CalendarGrid.</w:t>
+        <w:t>10. Loading skeleton se muestra durante 600ms.</w:t>
       </w:r>
     </w:p>
     <w:p>
       <w:r>
-        <w:t>11. El usuario hace clic en F2 o F3.</w:t>
+        <w:t>11. Los datos se cargan y se almacenan en el estado.</w:t>
       </w:r>
     </w:p>
     <w:p>
       <w:r>
-        <w:t>12. setActiveCategory actualiza el estado.</w:t>
+        <w:t>12. Se filtran las carreras por la categoría activa.</w:t>
       </w:r>
     </w:p>
     <w:p>
       <w:r>
-        <w:t>13. useMemo recalcula filteredRaces automáticamente.</w:t>
+        <w:t>13. Se detecta la próxima carrera por fecha.</w:t>
       </w:r>
     </w:p>
     <w:p>
       <w:r>
-        <w:t>14. Los componentes se re-renderizan con los nuevos datos.</w:t>
+        <w:t>14. Se renderizan Hero y CalendarGrid.</w:t>
+      </w:r>
+    </w:p>
+    <w:p>
+      <w:r>
+        <w:t>15. El usuario puede cambiar de categoría (F1/F2/F3) desde el nav, o volver a inicio con "← Categorías".</w:t>
       </w:r>
     </w:p>
     <w:p>
@@ -951,7 +1267,7 @@
         <w:pStyle w:val="ListBullet"/>
       </w:pPr>
       <w:r>
-        <w:t>Añadir el nuevo valor al array CATEGORIES en CategoryNav.jsx.</w:t>
+        <w:t>Agregar la categoría a HomePage.jsx o ExtrasPage.jsx según corresponda.</w:t>
       </w:r>
     </w:p>
     <w:p>
@@ -959,7 +1275,15 @@
         <w:pStyle w:val="ListBullet"/>
       </w:pPr>
       <w:r>
-        <w:t>Opcional: agregar un color en CATEGORY_COLORS.</w:t>
+        <w:t>Opcional: agregar un gradiente en el objeto GRADIENTS de CategoryCard.jsx.</w:t>
+      </w:r>
+    </w:p>
+    <w:p>
+      <w:pPr>
+        <w:pStyle w:val="ListBullet"/>
+      </w:pPr>
+      <w:r>
+        <w:t>Para que aparezca en el nav de F1Dashboard, agregarla al array MAIN_CATEGORIES.</w:t>
       </w:r>
     </w:p>
     <w:p>
@@ -1079,7 +1403,7 @@
         <w:pStyle w:val="ListBullet"/>
       </w:pPr>
       <w:r>
-        <w:t>react ^19.2.6       Biblioteca principal de UI</w:t>
+        <w:t>react ^19.2.6             Biblioteca principal de UI</w:t>
       </w:r>
     </w:p>
     <w:p>
@@ -1087,7 +1411,15 @@
         <w:pStyle w:val="ListBullet"/>
       </w:pPr>
       <w:r>
-        <w:t>react-dom ^19.2.6   Renderizado en el DOM</w:t>
+        <w:t>react-dom ^19.2.6         Renderizado en el DOM</w:t>
+      </w:r>
+    </w:p>
+    <w:p>
+      <w:pPr>
+        <w:pStyle w:val="ListBullet"/>
+      </w:pPr>
+      <w:r>
+        <w:t>react-router-dom ^6.x     Enrutamiento y navegación</w:t>
       </w:r>
     </w:p>
     <w:p>
@@ -1233,6 +1565,17 @@
       </w:r>
       <w:r>
         <w:t>Configuración de Vercel, deploy automático, fix de Tailwind CSS v4.</w:t>
+      </w:r>
+    </w:p>
+    <w:p>
+      <w:r>
+        <w:rPr>
+          <w:b/>
+        </w:rPr>
+        <w:t xml:space="preserve">Alpha 0.2.0 (15/06/2026): </w:t>
+      </w:r>
+      <w:r>
+        <w:t>Página principal con cards de categorías, React Router, categorías adicionales (IndyCar, NASCAR, WEC, MotoGP).</w:t>
       </w:r>
     </w:p>
     <w:sectPr>

</xml_diff>